<commit_message>
refactor: replace real instructor names with generic academic titles across UI, DB seeds, and documentation
</commit_message>
<xml_diff>
--- a/03_Tai_Lieu_Do_An/PHAN_DINH_NGHIEP_VU_4_CSDL_NOSQL_EDUPRO.docx
+++ b/03_Tai_Lieu_Do_An/PHAN_DINH_NGHIEP_VU_4_CSDL_NOSQL_EDUPRO.docx
@@ -102,7 +102,7 @@
           <w:color w:val="0F172A"/>
           <w:sz w:val="21"/>
         </w:rPr>
-        <w:t>• Giảng viên hướng dẫn: TS. Nguyễn Thị Định</w:t>
+        <w:t>• Giảng viên hướng dẫn: Giảng viên Bộ môn Hệ thống Thông tin</w:t>
         <w:br/>
         <w:t>• Đơn vị đào tạo: Khoa Công nghệ Thông tin - Trường ĐH Công Thương TP.HCM (HUIT)</w:t>
         <w:br/>
@@ -2845,7 +2845,7 @@
           <w:color w:val="0F172A"/>
           <w:sz w:val="22"/>
         </w:rPr>
-        <w:t>Khi bảo vệ đồ án trước Hội đồng / Giảng viên hướng dẫn (TS. Nguyễn Thị Định), sinh viên có thể khởi động nhanh toàn bộ 4 phần mềm quản trị CSDL bằng cách chạy tệp Mo_4_Phan_Mem_CSDL.bat tại thư mục gốc (hoặc bấm phím A để mở tất cả). Bảng 1.3 cung cấp hướng dẫn thao tác chi tiết và câu lệnh truy vấn mẫu cho từng phần mềm:</w:t>
+        <w:t>Khi bảo vệ đồ án trước Hội đồng / Giảng viên hướng dẫn (Giảng viên phụ trách), sinh viên có thể khởi động nhanh toàn bộ 4 phần mềm quản trị CSDL bằng cách chạy tệp Mo_4_Phan_Mem_CSDL.bat tại thư mục gốc (hoặc bấm phím A để mở tất cả). Bảng 1.3 cung cấp hướng dẫn thao tác chi tiết và câu lệnh truy vấn mẫu cho từng phần mềm:</w:t>
       </w:r>
     </w:p>
     <w:p>

</xml_diff>